<commit_message>
Book 2 Ch 11: soften why Moses fled to Midian
Co-Authored-By: Claude Opus 5.5 <noreply@anthropic.com>
Claude-Session: https://claude.ai/code/session_01MoWmDNVtH34VN9ywvoYJRo
</commit_message>
<xml_diff>
--- a/book2/Book2_Full_Draft.docx
+++ b/book2/Book2_Full_Draft.docx
@@ -4727,7 +4727,7 @@
         <w:pStyle w:val="BodyText"/>
       </w:pPr>
       <w:r>
-        <w:t xml:space="preserve">One day, Moses saw an Egyptian beating a Hebrew worker. In anger, Moses struck the Egyptian and killed him. When Pharaoh found out, Moses ran for his life to the land of</w:t>
+        <w:t xml:space="preserve">One day, Moses saw an Egyptian beating a Hebrew worker. Moses rushed in to stop him, but he acted in anger, and the Egyptian lost his life. When Pharaoh heard what had happened, he was furious, so Moses ran away to the land of</w:t>
       </w:r>
       <w:r>
         <w:t xml:space="preserve"> </w:t>
@@ -4757,7 +4757,7 @@
         <w:t xml:space="preserve">“</w:t>
       </w:r>
       <w:r>
-        <w:t xml:space="preserve">Moses did that?</w:t>
+        <w:t xml:space="preserve">Moses got in that much trouble?</w:t>
       </w:r>
       <w:r>
         <w:t xml:space="preserve">”</w:t>
@@ -4780,16 +4780,16 @@
         <w:t xml:space="preserve"> </w:t>
       </w:r>
       <w:r>
-        <w:t xml:space="preserve">Grandma said.</w:t>
-      </w:r>
-      <w:r>
-        <w:t xml:space="preserve"> </w:t>
-      </w:r>
-      <w:r>
-        <w:t xml:space="preserve">“</w:t>
-      </w:r>
-      <w:r>
-        <w:t xml:space="preserve">Moses wanted justice, but anger isn’t God’s way of bringing it. The Bible tells the truth about its heroes, even their mistakes.</w:t>
+        <w:t xml:space="preserve">Grandma said gently.</w:t>
+      </w:r>
+      <w:r>
+        <w:t xml:space="preserve"> </w:t>
+      </w:r>
+      <w:r>
+        <w:t xml:space="preserve">“</w:t>
+      </w:r>
+      <w:r>
+        <w:t xml:space="preserve">Moses wanted to protect his people, but he acted in anger instead of waiting on God. The Bible tells the truth about its heroes, even their mistakes. And God still had a plan for Moses.</w:t>
       </w:r>
       <w:r>
         <w:t xml:space="preserve">”</w:t>

</xml_diff>

<commit_message>
Book 2: set Book 3 teaser title (From Moses to Yeshua: The Promise Fulfilled)
Co-Authored-By: Claude Opus 5.5 <noreply@anthropic.com>
Claude-Session: https://claude.ai/code/session_01MoWmDNVtH34VN9ywvoYJRo
</commit_message>
<xml_diff>
--- a/book2/Book2_Full_Draft.docx
+++ b/book2/Book2_Full_Draft.docx
@@ -6540,8 +6540,10 @@
         <w:rPr>
           <w:iCs/>
           <w:i/>
-        </w:rPr>
-        <w:t xml:space="preserve">[Title to be decided]</w:t>
+          <w:bCs/>
+          <w:b/>
+        </w:rPr>
+        <w:t xml:space="preserve">From Moses to Yeshua: The Promise Fulfilled</w:t>
       </w:r>
       <w:r>
         <w:t xml:space="preserve"> </w:t>

</xml_diff>

<commit_message>
Rename Book 1/2/3 to Part 1/2/3 across Part 2 drafts, brief and social kit
Series is a 3-part 'Joesiah & Malani Time Travel Adventure'. Updates the
Part 2 outline, chapter drafts, full draft, illustration brief, layout
preview title page, and rebuilds the social graphics and videos.

Co-Authored-By: Claude Opus 5.5 <noreply@anthropic.com>
Claude-Session: https://claude.ai/code/session_01MoWmDNVtH34VN9ywvoYJRo
</commit_message>
<xml_diff>
--- a/book2/Book2_Full_Draft.docx
+++ b/book2/Book2_Full_Draft.docx
@@ -2,31 +2,31 @@
 <file path=word/document.xml><?xml version="1.0" encoding="utf-8"?>
 <w:document xmlns:w="http://schemas.openxmlformats.org/wordprocessingml/2006/main" xmlns:m="http://schemas.openxmlformats.org/officeDocument/2006/math" xmlns:r="http://schemas.openxmlformats.org/officeDocument/2006/relationships" xmlns:o="urn:schemas-microsoft-com:office:office" xmlns:v="urn:schemas-microsoft-com:vml" xmlns:w10="urn:schemas-microsoft-com:office:word" xmlns:a="http://schemas.openxmlformats.org/drawingml/2006/main" xmlns:pic="http://schemas.openxmlformats.org/drawingml/2006/picture" xmlns:wp="http://schemas.openxmlformats.org/drawingml/2006/wordprocessingDrawing">
   <w:body>
-    <w:bookmarkStart w:id="22" w:name="joesiah-malani"/>
+    <w:bookmarkStart w:id="22" w:name="joesiah-malani-time-travel-adventure"/>
     <w:p>
       <w:pPr>
         <w:pStyle w:val="Heading1"/>
       </w:pPr>
       <w:r>
-        <w:t xml:space="preserve">Joesiah &amp; Malani</w:t>
-      </w:r>
-    </w:p>
-    <w:bookmarkStart w:id="21" w:name="X099ac8a06bd2f948f4c0fb397bc1e5cd8581e4a"/>
+        <w:t xml:space="preserve">Joesiah &amp; Malani Time Travel Adventure</w:t>
+      </w:r>
+    </w:p>
+    <w:bookmarkStart w:id="21" w:name="X855093ebd05eebd6107419539772a522f56a4ce"/>
     <w:p>
       <w:pPr>
         <w:pStyle w:val="Heading2"/>
       </w:pPr>
       <w:r>
-        <w:t xml:space="preserve">From Abraham to Moses: The Journey to Freedom</w:t>
-      </w:r>
-    </w:p>
-    <w:bookmarkStart w:id="20" w:name="book-2-full-first-draft"/>
+        <w:t xml:space="preserve">Part 2: From Abraham to Moses — The Journey to Freedom</w:t>
+      </w:r>
+    </w:p>
+    <w:bookmarkStart w:id="20" w:name="full-first-draft"/>
     <w:p>
       <w:pPr>
         <w:pStyle w:val="Heading3"/>
       </w:pPr>
       <w:r>
-        <w:t xml:space="preserve">Book 2 · Full First Draft</w:t>
+        <w:t xml:space="preserve">Full First Draft</w:t>
       </w:r>
     </w:p>
     <w:p>
@@ -6531,7 +6531,7 @@
           <w:bCs/>
           <w:b/>
         </w:rPr>
-        <w:t xml:space="preserve">Joesiah &amp; Malani · Book 3</w:t>
+        <w:t xml:space="preserve">Joesiah &amp; Malani Time Travel Adventure · Part 3</w:t>
       </w:r>
       <w:r>
         <w:t xml:space="preserve"> </w:t>

</xml_diff>